<commit_message>
barlow/finesst: align award period to 08/2029 graduation
Per FI decision (graduation stays August 2029): C&P FINESST entry now
01/2027-08/2029 (2 years, 8 months), total up to $133,000 ($50,000 per
budget year, final year partial) instead of 3 years / $150,000 running
to 12/2029 - four months past graduation. B6 budget note matches.
Solicitation supports partial duration: "Not all projects require
three years. Proposers should request the time needed." Timing item
closed in both READMEs; NSPIRES cover-page duration should be entered
as 3 (whole years only, POP spans into year 3).

Co-Authored-By: Claude Fable 5 <noreply@anthropic.com>
</commit_message>
<xml_diff>
--- a/barlow/finesst_final/B4_current_pending_FI_goodrich.docx
+++ b/barlow/finesst_final/B4_current_pending_FI_goodrich.docx
@@ -395,7 +395,7 @@
         <w:t xml:space="preserve">Start Date: </w:t>
       </w:r>
       <w:r>
-        <w:t>01/2027    End Date: 12/2029 (3 years)</w:t>
+        <w:t>01/2027    End Date: 08/2029 (2 years, 8 months)</w:t>
       </w:r>
       <w:r>
         <w:rPr>
@@ -415,7 +415,7 @@
         <w:t xml:space="preserve">Total Anticipated Amount: </w:t>
       </w:r>
       <w:r>
-        <w:t>up to $150,000 ($50,000 per budget year × 3 years)</w:t>
+        <w:t>up to $133,000 ($50,000 per budget year, final year partial)</w:t>
       </w:r>
     </w:p>
     <w:p>

</xml_diff>